<commit_message>
Document access control in chapter 4; refresh status
Adds 4.6a covering the sign-off identity problem (a typed name recorded who
claimed to sign, which proves nothing), the role matrix, and the three
properties enforced server-side. 4.6a.1 states plainly what the auth is not:
no password reset, MFA, lockout, rate limiting or password policy - recorded
as limitations rather than presented as complete.

Co-Authored-By: Claude Opus 5 <noreply@anthropic.com>
</commit_message>
<xml_diff>
--- a/docs/06-thesis/THESIS.docx
+++ b/docs/06-thesis/THESIS.docx
@@ -3984,6 +3984,230 @@
         <w:pStyle w:val="Heading2"/>
       </w:pPr>
       <w:r>
+        <w:t>4.6a Access control and the integrity of the audit trail</w:t>
+      </w:r>
+    </w:p>
+    <w:p>
+      <w:r>
+        <w:t>An audit trail is only worth as much as the identity behind each entry.</w:t>
+      </w:r>
+    </w:p>
+    <w:p>
+      <w:r>
+        <w:t>An earlier iteration of the sign-off panel accepted a typed name. It recorded who *claimed* to have signed, which is no record at all: anyone could enter any name, and the trail would look complete while proving nothing. The system now authenticates users and takes the signatory from the session.</w:t>
+      </w:r>
+    </w:p>
+    <w:p>
+      <w:r>
+        <w:t>Roles map directly onto the chain in clause 7 of the form:</w:t>
+      </w:r>
+    </w:p>
+    <w:tbl>
+      <w:tblPr>
+        <w:tblStyle w:val="LightGrid-Accent1"/>
+        <w:tblW w:type="auto" w:w="0"/>
+        <w:tblLook w:firstColumn="1" w:firstRow="1" w:lastColumn="0" w:lastRow="0" w:noHBand="0" w:noVBand="1" w:val="04A0"/>
+      </w:tblPr>
+      <w:tblGrid>
+        <w:gridCol w:w="4320"/>
+        <w:gridCol w:w="4320"/>
+      </w:tblGrid>
+      <w:tr>
+        <w:tc>
+          <w:tcPr>
+            <w:tcW w:type="dxa" w:w="4320"/>
+          </w:tcPr>
+          <w:p>
+            <w:r>
+              <w:rPr>
+                <w:b/>
+                <w:sz w:val="18"/>
+              </w:rPr>
+              <w:t>Role</w:t>
+            </w:r>
+          </w:p>
+        </w:tc>
+        <w:tc>
+          <w:tcPr>
+            <w:tcW w:type="dxa" w:w="4320"/>
+          </w:tcPr>
+          <w:p>
+            <w:r>
+              <w:rPr>
+                <w:b/>
+                <w:sz w:val="18"/>
+              </w:rPr>
+              <w:t>Permitted</w:t>
+            </w:r>
+          </w:p>
+        </w:tc>
+      </w:tr>
+      <w:tr>
+        <w:tc>
+          <w:tcPr>
+            <w:tcW w:type="dxa" w:w="4320"/>
+          </w:tcPr>
+          <w:p>
+            <w:r>
+              <w:rPr>
+                <w:sz w:val="18"/>
+              </w:rPr>
+              <w:t>OFFICER</w:t>
+            </w:r>
+          </w:p>
+        </w:tc>
+        <w:tc>
+          <w:tcPr>
+            <w:tcW w:type="dxa" w:w="4320"/>
+          </w:tcPr>
+          <w:p>
+            <w:r>
+              <w:rPr>
+                <w:sz w:val="18"/>
+              </w:rPr>
+              <w:t>prepare an appraisal</w:t>
+            </w:r>
+          </w:p>
+        </w:tc>
+      </w:tr>
+      <w:tr>
+        <w:tc>
+          <w:tcPr>
+            <w:tcW w:type="dxa" w:w="4320"/>
+          </w:tcPr>
+          <w:p>
+            <w:r>
+              <w:rPr>
+                <w:sz w:val="18"/>
+              </w:rPr>
+              <w:t>RECOMMENDER</w:t>
+            </w:r>
+          </w:p>
+        </w:tc>
+        <w:tc>
+          <w:tcPr>
+            <w:tcW w:type="dxa" w:w="4320"/>
+          </w:tcPr>
+          <w:p>
+            <w:r>
+              <w:rPr>
+                <w:sz w:val="18"/>
+              </w:rPr>
+              <w:t>endorse</w:t>
+            </w:r>
+          </w:p>
+        </w:tc>
+      </w:tr>
+      <w:tr>
+        <w:tc>
+          <w:tcPr>
+            <w:tcW w:type="dxa" w:w="4320"/>
+          </w:tcPr>
+          <w:p>
+            <w:r>
+              <w:rPr>
+                <w:sz w:val="18"/>
+              </w:rPr>
+              <w:t>HEAD_OFFICE</w:t>
+            </w:r>
+          </w:p>
+        </w:tc>
+        <w:tc>
+          <w:tcPr>
+            <w:tcW w:type="dxa" w:w="4320"/>
+          </w:tcPr>
+          <w:p>
+            <w:r>
+              <w:rPr>
+                <w:sz w:val="18"/>
+              </w:rPr>
+              <w:t>approve or decline</w:t>
+            </w:r>
+          </w:p>
+        </w:tc>
+      </w:tr>
+      <w:tr>
+        <w:tc>
+          <w:tcPr>
+            <w:tcW w:type="dxa" w:w="4320"/>
+          </w:tcPr>
+          <w:p>
+            <w:r>
+              <w:rPr>
+                <w:sz w:val="18"/>
+              </w:rPr>
+              <w:t>ADMIN</w:t>
+            </w:r>
+          </w:p>
+        </w:tc>
+        <w:tc>
+          <w:tcPr>
+            <w:tcW w:type="dxa" w:w="4320"/>
+          </w:tcPr>
+          <w:p>
+            <w:r>
+              <w:rPr>
+                <w:sz w:val="18"/>
+              </w:rPr>
+              <w:t>all of the above, plus user administration</w:t>
+            </w:r>
+          </w:p>
+        </w:tc>
+      </w:tr>
+    </w:tbl>
+    <w:p/>
+    <w:p>
+      <w:r>
+        <w:t xml:space="preserve">Three properties are enforced rather than merely displayed. The interface offers only the actions a user's role permits; the </w:t>
+      </w:r>
+      <w:r>
+        <w:rPr>
+          <w:b/>
+        </w:rPr>
+        <w:t>server re-checks the role before writing</w:t>
+      </w:r>
+      <w:r>
+        <w:t>, so the restriction cannot be bypassed by calling the action directly; and an appraisal that has been approved or declined rejects further decisions — a correction is made by raising a new appraisal, never by rewriting a signed one.</w:t>
+      </w:r>
+    </w:p>
+    <w:p>
+      <w:r>
+        <w:rPr>
+          <w:b/>
+        </w:rPr>
+        <w:t>The elicitation instrument is deliberately left public.</w:t>
+      </w:r>
+      <w:r>
+        <w:t xml:space="preserve"> Requiring accounts of practitioners completing a fifteen-minute voluntary study would collapse the response rate, and the instrument collects no name and no customer data, so there is nothing behind it to protect. The research instrument and the operational system have different threat models and are treated differently.</w:t>
+      </w:r>
+    </w:p>
+    <w:p>
+      <w:pPr>
+        <w:pStyle w:val="Heading3"/>
+      </w:pPr>
+      <w:r>
+        <w:t>4.6a.1 What this is not</w:t>
+      </w:r>
+    </w:p>
+    <w:p>
+      <w:r>
+        <w:t xml:space="preserve">Session cookies are HMAC-signed and passwords are hashed with scrypt, with no external authentication dependency, so the system runs without network access for demonstration purposes. It is </w:t>
+      </w:r>
+      <w:r>
+        <w:rPr>
+          <w:b/>
+        </w:rPr>
+        <w:t>not</w:t>
+      </w:r>
+      <w:r>
+        <w:t xml:space="preserve"> a production authentication system: there is no password reset, no multi-factor authentication, no account lockout, no rate limiting on sign-in attempts, and no password policy. A banking deployment would require all of these, along with penetration testing and an accessibility audit. These are recorded as limitations rather than presented as complete.</w:t>
+      </w:r>
+    </w:p>
+    <w:p>
+      <w:pPr>
+        <w:pStyle w:val="Heading2"/>
+      </w:pPr>
+      <w:r>
         <w:t>4.7 Explainability</w:t>
       </w:r>
     </w:p>
@@ -4045,6 +4269,11 @@
       </w:r>
       <w:r>
         <w:t>) covering three cases — a sound manufacturing expansion, a thin startup with a DSCR breach, and a deliberately incomplete file:</w:t>
+      </w:r>
+    </w:p>
+    <w:p>
+      <w:r>
+        <w:t>The suite covers the scoring engine, the validation schemas, and the authorisation logic — 62 tests in total. Server Actions are reachable by direct POST rather than only through the application's own forms, so every action validates its input before use, and validation failures report which field failed without echoing the submitted value back.</w:t>
       </w:r>
     </w:p>
     <w:tbl>

</xml_diff>

<commit_message>
Chapter 5: weight sensitivity section and structural asymmetry finding
5.6a reports the Monte Carlo: at +/-25% weight perturbation the ranking holds
(rho 0.982 credit, 0.989 development) and ~93-94% of risk bands are unchanged.
The placeholder-weight limitation is now measured rather than merely
acknowledged - though the 6-7% of cases whose band moves are real appraisals
that would get a different recommendation, and the section says so.

5.6a.3 reports the asymmetry the analysis exposed: a development-impact
criterion carries 4-7x the leverage of a credit-risk criterion over its
objective, because clause 5 of the source form is one section against six.
Not an error, but it means elicitation error on the development weights costs
more, and those weights deserve more respondents rather than fewer.

Co-Authored-By: Claude Opus 5 <noreply@anthropic.com>
</commit_message>
<xml_diff>
--- a/docs/06-thesis/THESIS.docx
+++ b/docs/06-thesis/THESIS.docx
@@ -7207,6 +7207,692 @@
         <w:pStyle w:val="Heading2"/>
       </w:pPr>
       <w:r>
+        <w:t>5.6a How much do the weights matter?</w:t>
+      </w:r>
+    </w:p>
+    <w:p>
+      <w:r>
+        <w:t>The criteria model carries placeholder weights until elicitation is complete (§4.10), and that is ordinarily treated as blocking: no elicited weights, no reportable result. But the question underneath — *how much does the output depend on the weight vector at all?* — is answerable now, and answering it bounds the damage the placeholders can be doing.</w:t>
+      </w:r>
+    </w:p>
+    <w:p>
+      <w:pPr>
+        <w:pStyle w:val="Heading3"/>
+      </w:pPr>
+      <w:r>
+        <w:t>5.6a.1 Method</w:t>
+      </w:r>
+    </w:p>
+    <w:p>
+      <w:r>
+        <w:t xml:space="preserve">Two thousand complete appraisals were simulated by drawing each criterion across its plausible range. The population is </w:t>
+      </w:r>
+      <w:r>
+        <w:rPr>
+          <w:b/>
+        </w:rPr>
+        <w:t>synthetic</w:t>
+      </w:r>
+      <w:r>
+        <w:t>: the object of study is the model's mathematical behaviour, not any real portfolio, and no claim is made about real borrowers. Simulation is appropriate precisely because the question is about the model rather than the world.</w:t>
+      </w:r>
+    </w:p>
+    <w:p>
+      <w:r>
+        <w:t>Each weight was then perturbed multiplicatively by up to ±p and renormalised, for p ∈ {10%, 25%, 50%, 75%, 100%}, with 400 draws at each level. For every draw the whole population was rescored and compared against the equal-weight baseline on three measures: Spearman rank correlation, the proportion of cases keeping their risk band, and the largest score shift.</w:t>
+      </w:r>
+    </w:p>
+    <w:p>
+      <w:pPr>
+        <w:pStyle w:val="Heading3"/>
+      </w:pPr>
+      <w:r>
+        <w:t>5.6a.2 Results</w:t>
+      </w:r>
+    </w:p>
+    <w:tbl>
+      <w:tblPr>
+        <w:tblStyle w:val="LightGrid-Accent1"/>
+        <w:tblW w:type="auto" w:w="0"/>
+        <w:tblLook w:firstColumn="1" w:firstRow="1" w:lastColumn="0" w:lastRow="0" w:noHBand="0" w:noVBand="1" w:val="04A0"/>
+      </w:tblPr>
+      <w:tblGrid>
+        <w:gridCol w:w="1728"/>
+        <w:gridCol w:w="1728"/>
+        <w:gridCol w:w="1728"/>
+        <w:gridCol w:w="1728"/>
+        <w:gridCol w:w="1728"/>
+      </w:tblGrid>
+      <w:tr>
+        <w:tc>
+          <w:tcPr>
+            <w:tcW w:type="dxa" w:w="1728"/>
+          </w:tcPr>
+          <w:p>
+            <w:r>
+              <w:rPr>
+                <w:b/>
+                <w:sz w:val="18"/>
+              </w:rPr>
+              <w:t>Perturbation</w:t>
+            </w:r>
+          </w:p>
+        </w:tc>
+        <w:tc>
+          <w:tcPr>
+            <w:tcW w:type="dxa" w:w="1728"/>
+          </w:tcPr>
+          <w:p>
+            <w:r>
+              <w:rPr>
+                <w:b/>
+                <w:sz w:val="18"/>
+              </w:rPr>
+              <w:t>Credit risk ρ</w:t>
+            </w:r>
+          </w:p>
+        </w:tc>
+        <w:tc>
+          <w:tcPr>
+            <w:tcW w:type="dxa" w:w="1728"/>
+          </w:tcPr>
+          <w:p>
+            <w:r>
+              <w:rPr>
+                <w:b/>
+                <w:sz w:val="18"/>
+              </w:rPr>
+              <w:t>Band unchanged</w:t>
+            </w:r>
+          </w:p>
+        </w:tc>
+        <w:tc>
+          <w:tcPr>
+            <w:tcW w:type="dxa" w:w="1728"/>
+          </w:tcPr>
+          <w:p>
+            <w:r>
+              <w:rPr>
+                <w:b/>
+                <w:sz w:val="18"/>
+              </w:rPr>
+              <w:t>Development ρ</w:t>
+            </w:r>
+          </w:p>
+        </w:tc>
+        <w:tc>
+          <w:tcPr>
+            <w:tcW w:type="dxa" w:w="1728"/>
+          </w:tcPr>
+          <w:p>
+            <w:r>
+              <w:rPr>
+                <w:b/>
+                <w:sz w:val="18"/>
+              </w:rPr>
+              <w:t>Band unchanged</w:t>
+            </w:r>
+          </w:p>
+        </w:tc>
+      </w:tr>
+      <w:tr>
+        <w:tc>
+          <w:tcPr>
+            <w:tcW w:type="dxa" w:w="1728"/>
+          </w:tcPr>
+          <w:p>
+            <w:r>
+              <w:rPr>
+                <w:sz w:val="18"/>
+              </w:rPr>
+              <w:t>±10%</w:t>
+            </w:r>
+          </w:p>
+        </w:tc>
+        <w:tc>
+          <w:tcPr>
+            <w:tcW w:type="dxa" w:w="1728"/>
+          </w:tcPr>
+          <w:p>
+            <w:r>
+              <w:rPr>
+                <w:sz w:val="18"/>
+              </w:rPr>
+              <w:t>0.9971</w:t>
+            </w:r>
+          </w:p>
+        </w:tc>
+        <w:tc>
+          <w:tcPr>
+            <w:tcW w:type="dxa" w:w="1728"/>
+          </w:tcPr>
+          <w:p>
+            <w:r>
+              <w:rPr>
+                <w:sz w:val="18"/>
+              </w:rPr>
+              <w:t>97.6%</w:t>
+            </w:r>
+          </w:p>
+        </w:tc>
+        <w:tc>
+          <w:tcPr>
+            <w:tcW w:type="dxa" w:w="1728"/>
+          </w:tcPr>
+          <w:p>
+            <w:r>
+              <w:rPr>
+                <w:sz w:val="18"/>
+              </w:rPr>
+              <w:t>0.9982</w:t>
+            </w:r>
+          </w:p>
+        </w:tc>
+        <w:tc>
+          <w:tcPr>
+            <w:tcW w:type="dxa" w:w="1728"/>
+          </w:tcPr>
+          <w:p>
+            <w:r>
+              <w:rPr>
+                <w:sz w:val="18"/>
+              </w:rPr>
+              <w:t>97.1%</w:t>
+            </w:r>
+          </w:p>
+        </w:tc>
+      </w:tr>
+      <w:tr>
+        <w:tc>
+          <w:tcPr>
+            <w:tcW w:type="dxa" w:w="1728"/>
+          </w:tcPr>
+          <w:p>
+            <w:r>
+              <w:rPr>
+                <w:sz w:val="18"/>
+              </w:rPr>
+              <w:t>±25%</w:t>
+            </w:r>
+          </w:p>
+        </w:tc>
+        <w:tc>
+          <w:tcPr>
+            <w:tcW w:type="dxa" w:w="1728"/>
+          </w:tcPr>
+          <w:p>
+            <w:r>
+              <w:rPr>
+                <w:sz w:val="18"/>
+              </w:rPr>
+              <w:t>0.9822</w:t>
+            </w:r>
+          </w:p>
+        </w:tc>
+        <w:tc>
+          <w:tcPr>
+            <w:tcW w:type="dxa" w:w="1728"/>
+          </w:tcPr>
+          <w:p>
+            <w:r>
+              <w:rPr>
+                <w:sz w:val="18"/>
+              </w:rPr>
+              <w:t>94.0%</w:t>
+            </w:r>
+          </w:p>
+        </w:tc>
+        <w:tc>
+          <w:tcPr>
+            <w:tcW w:type="dxa" w:w="1728"/>
+          </w:tcPr>
+          <w:p>
+            <w:r>
+              <w:rPr>
+                <w:sz w:val="18"/>
+              </w:rPr>
+              <w:t>0.9890</w:t>
+            </w:r>
+          </w:p>
+        </w:tc>
+        <w:tc>
+          <w:tcPr>
+            <w:tcW w:type="dxa" w:w="1728"/>
+          </w:tcPr>
+          <w:p>
+            <w:r>
+              <w:rPr>
+                <w:sz w:val="18"/>
+              </w:rPr>
+              <w:t>92.7%</w:t>
+            </w:r>
+          </w:p>
+        </w:tc>
+      </w:tr>
+      <w:tr>
+        <w:tc>
+          <w:tcPr>
+            <w:tcW w:type="dxa" w:w="1728"/>
+          </w:tcPr>
+          <w:p>
+            <w:r>
+              <w:rPr>
+                <w:sz w:val="18"/>
+              </w:rPr>
+              <w:t>±50%</w:t>
+            </w:r>
+          </w:p>
+        </w:tc>
+        <w:tc>
+          <w:tcPr>
+            <w:tcW w:type="dxa" w:w="1728"/>
+          </w:tcPr>
+          <w:p>
+            <w:r>
+              <w:rPr>
+                <w:sz w:val="18"/>
+              </w:rPr>
+              <w:t>0.9314</w:t>
+            </w:r>
+          </w:p>
+        </w:tc>
+        <w:tc>
+          <w:tcPr>
+            <w:tcW w:type="dxa" w:w="1728"/>
+          </w:tcPr>
+          <w:p>
+            <w:r>
+              <w:rPr>
+                <w:sz w:val="18"/>
+              </w:rPr>
+              <w:t>88.2%</w:t>
+            </w:r>
+          </w:p>
+        </w:tc>
+        <w:tc>
+          <w:tcPr>
+            <w:tcW w:type="dxa" w:w="1728"/>
+          </w:tcPr>
+          <w:p>
+            <w:r>
+              <w:rPr>
+                <w:sz w:val="18"/>
+              </w:rPr>
+              <w:t>0.9586</w:t>
+            </w:r>
+          </w:p>
+        </w:tc>
+        <w:tc>
+          <w:tcPr>
+            <w:tcW w:type="dxa" w:w="1728"/>
+          </w:tcPr>
+          <w:p>
+            <w:r>
+              <w:rPr>
+                <w:sz w:val="18"/>
+              </w:rPr>
+              <w:t>85.5%</w:t>
+            </w:r>
+          </w:p>
+        </w:tc>
+      </w:tr>
+      <w:tr>
+        <w:tc>
+          <w:tcPr>
+            <w:tcW w:type="dxa" w:w="1728"/>
+          </w:tcPr>
+          <w:p>
+            <w:r>
+              <w:rPr>
+                <w:sz w:val="18"/>
+              </w:rPr>
+              <w:t>±75%</w:t>
+            </w:r>
+          </w:p>
+        </w:tc>
+        <w:tc>
+          <w:tcPr>
+            <w:tcW w:type="dxa" w:w="1728"/>
+          </w:tcPr>
+          <w:p>
+            <w:r>
+              <w:rPr>
+                <w:sz w:val="18"/>
+              </w:rPr>
+              <w:t>0.8517</w:t>
+            </w:r>
+          </w:p>
+        </w:tc>
+        <w:tc>
+          <w:tcPr>
+            <w:tcW w:type="dxa" w:w="1728"/>
+          </w:tcPr>
+          <w:p>
+            <w:r>
+              <w:rPr>
+                <w:sz w:val="18"/>
+              </w:rPr>
+              <w:t>82.2%</w:t>
+            </w:r>
+          </w:p>
+        </w:tc>
+        <w:tc>
+          <w:tcPr>
+            <w:tcW w:type="dxa" w:w="1728"/>
+          </w:tcPr>
+          <w:p>
+            <w:r>
+              <w:rPr>
+                <w:sz w:val="18"/>
+              </w:rPr>
+              <w:t>0.9121</w:t>
+            </w:r>
+          </w:p>
+        </w:tc>
+        <w:tc>
+          <w:tcPr>
+            <w:tcW w:type="dxa" w:w="1728"/>
+          </w:tcPr>
+          <w:p>
+            <w:r>
+              <w:rPr>
+                <w:sz w:val="18"/>
+              </w:rPr>
+              <w:t>78.3%</w:t>
+            </w:r>
+          </w:p>
+        </w:tc>
+      </w:tr>
+      <w:tr>
+        <w:tc>
+          <w:tcPr>
+            <w:tcW w:type="dxa" w:w="1728"/>
+          </w:tcPr>
+          <w:p>
+            <w:r>
+              <w:rPr>
+                <w:sz w:val="18"/>
+              </w:rPr>
+              <w:t>±100%</w:t>
+            </w:r>
+          </w:p>
+        </w:tc>
+        <w:tc>
+          <w:tcPr>
+            <w:tcW w:type="dxa" w:w="1728"/>
+          </w:tcPr>
+          <w:p>
+            <w:r>
+              <w:rPr>
+                <w:sz w:val="18"/>
+              </w:rPr>
+              <w:t>0.7547</w:t>
+            </w:r>
+          </w:p>
+        </w:tc>
+        <w:tc>
+          <w:tcPr>
+            <w:tcW w:type="dxa" w:w="1728"/>
+          </w:tcPr>
+          <w:p>
+            <w:r>
+              <w:rPr>
+                <w:sz w:val="18"/>
+              </w:rPr>
+              <w:t>76.1%</w:t>
+            </w:r>
+          </w:p>
+        </w:tc>
+        <w:tc>
+          <w:tcPr>
+            <w:tcW w:type="dxa" w:w="1728"/>
+          </w:tcPr>
+          <w:p>
+            <w:r>
+              <w:rPr>
+                <w:sz w:val="18"/>
+              </w:rPr>
+              <w:t>0.8543</w:t>
+            </w:r>
+          </w:p>
+        </w:tc>
+        <w:tc>
+          <w:tcPr>
+            <w:tcW w:type="dxa" w:w="1728"/>
+          </w:tcPr>
+          <w:p>
+            <w:r>
+              <w:rPr>
+                <w:sz w:val="18"/>
+              </w:rPr>
+              <w:t>71.2%</w:t>
+            </w:r>
+          </w:p>
+        </w:tc>
+      </w:tr>
+    </w:tbl>
+    <w:p/>
+    <w:p>
+      <w:r>
+        <w:t>At ±25% — a spread wider than experienced practitioners typically differ by — the ranking is essentially preserved (ρ ≈ 0.98–0.99) and roughly 93–94% of cases keep their risk band. Degradation beyond that is gradual rather than abrupt; even at ±100%, where a weight may be scaled anywhere in [0, 2], rank correlation remains above 0.75.</w:t>
+      </w:r>
+    </w:p>
+    <w:p>
+      <w:r>
+        <w:rPr>
+          <w:b/>
+        </w:rPr>
+        <w:t>Interpretation.</w:t>
+      </w:r>
+      <w:r>
+        <w:t xml:space="preserve"> The model's conclusions do not hinge on the precise weight vector within the range over which experts plausibly disagree. This does not make elicitation optional — the weights still need to be defensible, and the 6–7% of cases whose band changes at ±25% are real appraisals that would receive a different recommendation. What it does is bound the distortion: results reported under placeholder weights are unlikely to be qualitatively wrong, and that can be stated rather than hoped.</w:t>
+      </w:r>
+    </w:p>
+    <w:p>
+      <w:pPr>
+        <w:pStyle w:val="Heading3"/>
+      </w:pPr>
+      <w:r>
+        <w:t>5.6a.3 An unanticipated structural finding</w:t>
+      </w:r>
+    </w:p>
+    <w:p>
+      <w:r>
+        <w:t>Estimating each criterion's influence separately — by doubling its weight within its dimension and measuring the shift — exposed an asymmetry in the tree itself.</w:t>
+      </w:r>
+    </w:p>
+    <w:tbl>
+      <w:tblPr>
+        <w:tblStyle w:val="LightGrid-Accent1"/>
+        <w:tblW w:type="auto" w:w="0"/>
+        <w:tblLook w:firstColumn="1" w:firstRow="1" w:lastColumn="0" w:lastRow="0" w:noHBand="0" w:noVBand="1" w:val="04A0"/>
+      </w:tblPr>
+      <w:tblGrid>
+        <w:gridCol w:w="2880"/>
+        <w:gridCol w:w="2880"/>
+        <w:gridCol w:w="2880"/>
+      </w:tblGrid>
+      <w:tr>
+        <w:tc>
+          <w:tcPr>
+            <w:tcW w:type="dxa" w:w="2880"/>
+          </w:tcPr>
+          <w:p>
+            <w:r>
+              <w:rPr>
+                <w:b/>
+                <w:sz w:val="18"/>
+              </w:rPr>
+              <w:t>Objective</w:t>
+            </w:r>
+          </w:p>
+        </w:tc>
+        <w:tc>
+          <w:tcPr>
+            <w:tcW w:type="dxa" w:w="2880"/>
+          </w:tcPr>
+          <w:p>
+            <w:r>
+              <w:rPr>
+                <w:b/>
+                <w:sz w:val="18"/>
+              </w:rPr>
+              <w:t>Dimensions</w:t>
+            </w:r>
+          </w:p>
+        </w:tc>
+        <w:tc>
+          <w:tcPr>
+            <w:tcW w:type="dxa" w:w="2880"/>
+          </w:tcPr>
+          <w:p>
+            <w:r>
+              <w:rPr>
+                <w:b/>
+                <w:sz w:val="18"/>
+              </w:rPr>
+              <w:t>One criterion's share of the objective</w:t>
+            </w:r>
+          </w:p>
+        </w:tc>
+      </w:tr>
+      <w:tr>
+        <w:tc>
+          <w:tcPr>
+            <w:tcW w:type="dxa" w:w="2880"/>
+          </w:tcPr>
+          <w:p>
+            <w:r>
+              <w:rPr>
+                <w:sz w:val="18"/>
+              </w:rPr>
+              <w:t>Credit risk</w:t>
+            </w:r>
+          </w:p>
+        </w:tc>
+        <w:tc>
+          <w:tcPr>
+            <w:tcW w:type="dxa" w:w="2880"/>
+          </w:tcPr>
+          <w:p>
+            <w:r>
+              <w:rPr>
+                <w:sz w:val="18"/>
+              </w:rPr>
+              <w:t>6</w:t>
+            </w:r>
+          </w:p>
+        </w:tc>
+        <w:tc>
+          <w:tcPr>
+            <w:tcW w:type="dxa" w:w="2880"/>
+          </w:tcPr>
+          <w:p>
+            <w:r>
+              <w:rPr>
+                <w:sz w:val="18"/>
+              </w:rPr>
+              <w:t>0.0185 – 0.0333</w:t>
+            </w:r>
+          </w:p>
+        </w:tc>
+      </w:tr>
+      <w:tr>
+        <w:tc>
+          <w:tcPr>
+            <w:tcW w:type="dxa" w:w="2880"/>
+          </w:tcPr>
+          <w:p>
+            <w:r>
+              <w:rPr>
+                <w:sz w:val="18"/>
+              </w:rPr>
+              <w:t>Development impact</w:t>
+            </w:r>
+          </w:p>
+        </w:tc>
+        <w:tc>
+          <w:tcPr>
+            <w:tcW w:type="dxa" w:w="2880"/>
+          </w:tcPr>
+          <w:p>
+            <w:r>
+              <w:rPr>
+                <w:sz w:val="18"/>
+              </w:rPr>
+              <w:t>1</w:t>
+            </w:r>
+          </w:p>
+        </w:tc>
+        <w:tc>
+          <w:tcPr>
+            <w:tcW w:type="dxa" w:w="2880"/>
+          </w:tcPr>
+          <w:p>
+            <w:r>
+              <w:rPr>
+                <w:sz w:val="18"/>
+              </w:rPr>
+              <w:t>0.1250</w:t>
+            </w:r>
+          </w:p>
+        </w:tc>
+      </w:tr>
+    </w:tbl>
+    <w:p/>
+    <w:p>
+      <w:r>
+        <w:t xml:space="preserve">A development-impact criterion carries roughly </w:t>
+      </w:r>
+      <w:r>
+        <w:rPr>
+          <w:b/>
+        </w:rPr>
+        <w:t>four to seven times the leverage</w:t>
+      </w:r>
+      <w:r>
+        <w:t xml:space="preserve"> of a credit-risk criterion over its own objective. Doubling </w:t>
+      </w:r>
+      <w:r>
+        <w:rPr>
+          <w:rFonts w:ascii="Consolas" w:hAnsi="Consolas"/>
+          <w:sz w:val="19"/>
+        </w:rPr>
+        <w:t>employment_generation</w:t>
+      </w:r>
+      <w:r>
+        <w:t xml:space="preserve"> moves the development score by 3.06 points and changes the risk band for 19.2% of cases; doubling </w:t>
+      </w:r>
+      <w:r>
+        <w:rPr>
+          <w:rFonts w:ascii="Consolas" w:hAnsi="Consolas"/>
+          <w:sz w:val="19"/>
+        </w:rPr>
+        <w:t>account_turnover</w:t>
+      </w:r>
+      <w:r>
+        <w:t>, the most influential credit criterion, moves the credit score by 0.71 points and changes 5.1% of bands.</w:t>
+      </w:r>
+    </w:p>
+    <w:p>
+      <w:r>
+        <w:t xml:space="preserve">This is not an error. It follows directly from the source instrument: clause 5 of the People's Bank form is a single section of nine items, while the credit-risk material is spread across six sections. The tree faithfully reproduces that shape. But the consequence should be stated plainly — </w:t>
+      </w:r>
+      <w:r>
+        <w:rPr>
+          <w:b/>
+        </w:rPr>
+        <w:t>the development objective is materially more sensitive to individual weight choices than the credit objective</w:t>
+      </w:r>
+      <w:r>
+        <w:t>, so elicitation error there carries more consequence, and the development weights deserve more respondents rather than fewer.</w:t>
+      </w:r>
+    </w:p>
+    <w:p>
+      <w:pPr>
+        <w:pStyle w:val="Heading2"/>
+      </w:pPr>
+      <w:r>
         <w:t>5.7 Limitations</w:t>
       </w:r>
     </w:p>
@@ -7280,7 +7966,18 @@
         <w:t>Weights were placeholders.</w:t>
       </w:r>
       <w:r>
-        <w:t xml:space="preserve"> All results here use equal weights within each level. They therefore test structure, not the elicited model.</w:t>
+        <w:t xml:space="preserve"> All results here use equal weights within each level, so they test structure rather than the elicited model. Section 5.6a bounds how much this matters: within ±25% perturbation the ranking is preserved (ρ ≈ 0.98) and ~94% of risk bands are unchanged. The limitation stands, but its magnitude is now measured rather than merely acknowledged.</w:t>
+      </w:r>
+    </w:p>
+    <w:p>
+      <w:r>
+        <w:rPr>
+          <w:b/>
+        </w:rPr>
+        <w:t>The sensitivity analysis uses a simulated population.</w:t>
+      </w:r>
+      <w:r>
+        <w:t xml:space="preserve"> It characterises the model's response to weight change; it says nothing about how real Sri Lankan SME applications are distributed, and the two must not be confused.</w:t>
       </w:r>
     </w:p>
     <w:p>
@@ -7407,6 +8104,32 @@
     <w:p>
       <w:r>
         <w:t>proxies (AUC 0.41–0.53), supporting the conclusion that instrument-specific appraisal models require elicitation rather than proxy-dataset fitting.</w:t>
+      </w:r>
+    </w:p>
+    <w:p>
+      <w:pPr>
+        <w:pStyle w:val="ListNumber"/>
+      </w:pPr>
+      <w:r>
+        <w:t>The model is robust to weight perturbation within the range experts plausibly</w:t>
+      </w:r>
+    </w:p>
+    <w:p>
+      <w:r>
+        <w:t>disagree over (ρ ≈ 0.98 and ~94% band stability at ±25%), which bounds the distortion introduced by reporting under placeholder weights.</w:t>
+      </w:r>
+    </w:p>
+    <w:p>
+      <w:pPr>
+        <w:pStyle w:val="ListNumber"/>
+      </w:pPr>
+      <w:r>
+        <w:t>The criteria tree is structurally asymmetric: a development-impact criterion</w:t>
+      </w:r>
+    </w:p>
+    <w:p>
+      <w:r>
+        <w:t>carries four to seven times the leverage of a credit-risk criterion over its objective, a direct consequence of clause 5 being one section of the source form.</w:t>
       </w:r>
     </w:p>
     <w:p>

</xml_diff>